<commit_message>
Convert static buttons to dynamic cycles
</commit_message>
<xml_diff>
--- a/samples/sample_english.docx
+++ b/samples/sample_english.docx
@@ -19,11 +19,19 @@
       <w:pPr>
         <w:rPr>
           <w:rFonts w:hint="default"/>
+          <w:b/>
+          <w:bCs/>
+          <w:sz w:val="28"/>
+          <w:szCs w:val="28"/>
         </w:rPr>
       </w:pPr>
       <w:r>
         <w:rPr>
           <w:rFonts w:hint="default"/>
+          <w:b/>
+          <w:bCs/>
+          <w:sz w:val="28"/>
+          <w:szCs w:val="28"/>
         </w:rPr>
         <w:t>I am a student at Kathmandu University.</w:t>
       </w:r>
@@ -42,15 +50,29 @@
       </w:r>
     </w:p>
     <w:p>
+      <w:pPr>
+        <w:rPr>
+          <w:i/>
+          <w:iCs/>
+          <w:sz w:val="36"/>
+          <w:szCs w:val="36"/>
+          <w:u w:val="single"/>
+        </w:rPr>
+      </w:pPr>
+      <w:bookmarkStart w:id="0" w:name="_GoBack"/>
       <w:r>
         <w:rPr>
           <w:rFonts w:hint="default"/>
+          <w:i/>
+          <w:iCs/>
+          <w:sz w:val="36"/>
+          <w:szCs w:val="36"/>
+          <w:u w:val="single"/>
         </w:rPr>
         <w:t>Welcome to TinBhasha.</w:t>
       </w:r>
-      <w:bookmarkStart w:id="0" w:name="_GoBack"/>
-      <w:bookmarkEnd w:id="0"/>
     </w:p>
+    <w:bookmarkEnd w:id="0"/>
     <w:sectPr>
       <w:pgSz w:w="11906" w:h="16838"/>
       <w:pgMar w:top="1440" w:right="1800" w:bottom="1440" w:left="1800" w:header="720" w:footer="720" w:gutter="0"/>

</xml_diff>